<commit_message>
Insert 4 uploaded images and exact descriptions into final docx report
</commit_message>
<xml_diff>
--- a/docs/BaoCao_TieuLuan_GDU_MauChuan_PhanCongDong.docx
+++ b/docs/BaoCao_TieuLuan_GDU_MauChuan_PhanCongDong.docx
@@ -5146,6 +5146,61 @@
     </w:p>
     <w:p>
       <w:pPr>
+        <w:spacing w:before="160" w:after="80"/>
+        <w:jc w:val="center"/>
+      </w:pPr>
+      <w:r>
+        <w:drawing>
+          <wp:inline xmlns:a="http://schemas.openxmlformats.org/drawingml/2006/main" xmlns:pic="http://schemas.openxmlformats.org/drawingml/2006/picture">
+            <wp:extent cx="5303520" cy="2993322"/>
+            <wp:docPr id="3" name="Picture 3"/>
+            <wp:cNvGraphicFramePr>
+              <a:graphicFrameLocks noChangeAspect="1"/>
+            </wp:cNvGraphicFramePr>
+            <a:graphic>
+              <a:graphicData uri="http://schemas.openxmlformats.org/drawingml/2006/picture">
+                <pic:pic>
+                  <pic:nvPicPr>
+                    <pic:cNvPr id="0" name="so_do_nguyen_ly_hoat_dong.jpg"/>
+                    <pic:cNvPicPr/>
+                  </pic:nvPicPr>
+                  <pic:blipFill>
+                    <a:blip r:embed="rId11"/>
+                    <a:stretch>
+                      <a:fillRect/>
+                    </a:stretch>
+                  </pic:blipFill>
+                  <pic:spPr>
+                    <a:xfrm>
+                      <a:off x="0" y="0"/>
+                      <a:ext cx="5303520" cy="2993322"/>
+                    </a:xfrm>
+                    <a:prstGeom prst="rect"/>
+                  </pic:spPr>
+                </pic:pic>
+              </a:graphicData>
+            </a:graphic>
+          </wp:inline>
+        </w:drawing>
+      </w:r>
+    </w:p>
+    <w:p>
+      <w:pPr>
+        <w:spacing w:after="160"/>
+        <w:jc w:val="center"/>
+      </w:pPr>
+      <w:r>
+        <w:rPr>
+          <w:rFonts w:ascii="Times New Roman" w:hAnsi="Times New Roman"/>
+          <w:i/>
+          <w:color w:val="646464"/>
+          <w:sz w:val="22"/>
+        </w:rPr>
+        <w:t>Hình 0.2. Sơ đồ mô tả dòng chảy dữ liệu và nguyên lý hoạt động tổng thể của hệ thống</w:t>
+      </w:r>
+    </w:p>
+    <w:p>
+      <w:pPr>
         <w:keepNext/>
         <w:spacing w:line="360" w:lineRule="auto" w:before="280" w:after="120"/>
       </w:pPr>
@@ -5570,7 +5625,7 @@
         <w:drawing>
           <wp:inline xmlns:a="http://schemas.openxmlformats.org/drawingml/2006/main" xmlns:pic="http://schemas.openxmlformats.org/drawingml/2006/picture">
             <wp:extent cx="3474720" cy="1954530"/>
-            <wp:docPr id="3" name="Picture 3"/>
+            <wp:docPr id="4" name="Picture 4"/>
             <wp:cNvGraphicFramePr>
               <a:graphicFrameLocks noChangeAspect="1"/>
             </wp:cNvGraphicFramePr>
@@ -5582,7 +5637,7 @@
                     <pic:cNvPicPr/>
                   </pic:nvPicPr>
                   <pic:blipFill>
-                    <a:blip r:embed="rId11"/>
+                    <a:blip r:embed="rId12"/>
                     <a:stretch>
                       <a:fillRect/>
                     </a:stretch>
@@ -5742,7 +5797,7 @@
         <w:drawing>
           <wp:inline xmlns:a="http://schemas.openxmlformats.org/drawingml/2006/main" xmlns:pic="http://schemas.openxmlformats.org/drawingml/2006/picture">
             <wp:extent cx="3200400" cy="3091789"/>
-            <wp:docPr id="4" name="Picture 4"/>
+            <wp:docPr id="5" name="Picture 5"/>
             <wp:cNvGraphicFramePr>
               <a:graphicFrameLocks noChangeAspect="1"/>
             </wp:cNvGraphicFramePr>
@@ -5754,7 +5809,7 @@
                     <pic:cNvPicPr/>
                   </pic:nvPicPr>
                   <pic:blipFill>
-                    <a:blip r:embed="rId12"/>
+                    <a:blip r:embed="rId13"/>
                     <a:stretch>
                       <a:fillRect/>
                     </a:stretch>
@@ -5917,7 +5972,7 @@
         <w:drawing>
           <wp:inline xmlns:a="http://schemas.openxmlformats.org/drawingml/2006/main" xmlns:pic="http://schemas.openxmlformats.org/drawingml/2006/picture">
             <wp:extent cx="3291840" cy="1013887"/>
-            <wp:docPr id="5" name="Picture 5"/>
+            <wp:docPr id="6" name="Picture 6"/>
             <wp:cNvGraphicFramePr>
               <a:graphicFrameLocks noChangeAspect="1"/>
             </wp:cNvGraphicFramePr>
@@ -5929,7 +5984,7 @@
                     <pic:cNvPicPr/>
                   </pic:nvPicPr>
                   <pic:blipFill>
-                    <a:blip r:embed="rId13"/>
+                    <a:blip r:embed="rId14"/>
                     <a:stretch>
                       <a:fillRect/>
                     </a:stretch>
@@ -6104,7 +6159,7 @@
         <w:drawing>
           <wp:inline xmlns:a="http://schemas.openxmlformats.org/drawingml/2006/main" xmlns:pic="http://schemas.openxmlformats.org/drawingml/2006/picture">
             <wp:extent cx="2926080" cy="2913734"/>
-            <wp:docPr id="6" name="Picture 6"/>
+            <wp:docPr id="7" name="Picture 7"/>
             <wp:cNvGraphicFramePr>
               <a:graphicFrameLocks noChangeAspect="1"/>
             </wp:cNvGraphicFramePr>
@@ -6116,7 +6171,7 @@
                     <pic:cNvPicPr/>
                   </pic:nvPicPr>
                   <pic:blipFill>
-                    <a:blip r:embed="rId14"/>
+                    <a:blip r:embed="rId15"/>
                     <a:stretch>
                       <a:fillRect/>
                     </a:stretch>
@@ -6204,7 +6259,7 @@
         <w:drawing>
           <wp:inline xmlns:a="http://schemas.openxmlformats.org/drawingml/2006/main" xmlns:pic="http://schemas.openxmlformats.org/drawingml/2006/picture">
             <wp:extent cx="3108960" cy="2074535"/>
-            <wp:docPr id="7" name="Picture 7"/>
+            <wp:docPr id="8" name="Picture 8"/>
             <wp:cNvGraphicFramePr>
               <a:graphicFrameLocks noChangeAspect="1"/>
             </wp:cNvGraphicFramePr>
@@ -6216,7 +6271,7 @@
                     <pic:cNvPicPr/>
                   </pic:nvPicPr>
                   <pic:blipFill>
-                    <a:blip r:embed="rId15"/>
+                    <a:blip r:embed="rId16"/>
                     <a:stretch>
                       <a:fillRect/>
                     </a:stretch>
@@ -6326,6 +6381,61 @@
           <w:sz w:val="24"/>
         </w:rPr>
         <w:t>Màn hình tinh thể lỏng LCD 1602 có khả năng hiển thị 2 dòng, mỗi dòng 16 ký tự chữ số. Để tiết kiệm chân GPIO của ESP32, màn hình được hàn tích hợp module chuyển đổi nối tiếp sang song song PCF8574. Nhờ đó, thay vì phải tốn 6 đến 10 chân điều khiển song song, toàn bộ màn hình LCD chỉ sử dụng đúng 2 dây SDA (GPIO 21) và SCL (GPIO 22) chung với bus I2C của cảm biến gia tốc.</w:t>
+      </w:r>
+    </w:p>
+    <w:p>
+      <w:pPr>
+        <w:spacing w:before="160" w:after="80"/>
+        <w:jc w:val="center"/>
+      </w:pPr>
+      <w:r>
+        <w:drawing>
+          <wp:inline xmlns:a="http://schemas.openxmlformats.org/drawingml/2006/main" xmlns:pic="http://schemas.openxmlformats.org/drawingml/2006/picture">
+            <wp:extent cx="3474720" cy="3443275"/>
+            <wp:docPr id="9" name="Picture 9"/>
+            <wp:cNvGraphicFramePr>
+              <a:graphicFrameLocks noChangeAspect="1"/>
+            </wp:cNvGraphicFramePr>
+            <a:graphic>
+              <a:graphicData uri="http://schemas.openxmlformats.org/drawingml/2006/picture">
+                <pic:pic>
+                  <pic:nvPicPr>
+                    <pic:cNvPr id="0" name="lcd1602_module.jpg"/>
+                    <pic:cNvPicPr/>
+                  </pic:nvPicPr>
+                  <pic:blipFill>
+                    <a:blip r:embed="rId17"/>
+                    <a:stretch>
+                      <a:fillRect/>
+                    </a:stretch>
+                  </pic:blipFill>
+                  <pic:spPr>
+                    <a:xfrm>
+                      <a:off x="0" y="0"/>
+                      <a:ext cx="3474720" cy="3443275"/>
+                    </a:xfrm>
+                    <a:prstGeom prst="rect"/>
+                  </pic:spPr>
+                </pic:pic>
+              </a:graphicData>
+            </a:graphic>
+          </wp:inline>
+        </w:drawing>
+      </w:r>
+    </w:p>
+    <w:p>
+      <w:pPr>
+        <w:spacing w:after="160"/>
+        <w:jc w:val="center"/>
+      </w:pPr>
+      <w:r>
+        <w:rPr>
+          <w:rFonts w:ascii="Times New Roman" w:hAnsi="Times New Roman"/>
+          <w:i/>
+          <w:color w:val="646464"/>
+          <w:sz w:val="22"/>
+        </w:rPr>
+        <w:t>Hình 2.6. Màn hình tinh thể lỏng LCD 1602 kết hợp module chuyển đổi I2C PCF8574</w:t>
       </w:r>
     </w:p>
     <w:p>
@@ -7753,6 +7863,61 @@
     </w:p>
     <w:p>
       <w:pPr>
+        <w:spacing w:before="160" w:after="80"/>
+        <w:jc w:val="center"/>
+      </w:pPr>
+      <w:r>
+        <w:drawing>
+          <wp:inline xmlns:a="http://schemas.openxmlformats.org/drawingml/2006/main" xmlns:pic="http://schemas.openxmlformats.org/drawingml/2006/picture">
+            <wp:extent cx="5120640" cy="3130391"/>
+            <wp:docPr id="10" name="Picture 10"/>
+            <wp:cNvGraphicFramePr>
+              <a:graphicFrameLocks noChangeAspect="1"/>
+            </wp:cNvGraphicFramePr>
+            <a:graphic>
+              <a:graphicData uri="http://schemas.openxmlformats.org/drawingml/2006/picture">
+                <pic:pic>
+                  <pic:nvPicPr>
+                    <pic:cNvPr id="0" name="so_do_khoi_he_thong.jpg"/>
+                    <pic:cNvPicPr/>
+                  </pic:nvPicPr>
+                  <pic:blipFill>
+                    <a:blip r:embed="rId18"/>
+                    <a:stretch>
+                      <a:fillRect/>
+                    </a:stretch>
+                  </pic:blipFill>
+                  <pic:spPr>
+                    <a:xfrm>
+                      <a:off x="0" y="0"/>
+                      <a:ext cx="5120640" cy="3130391"/>
+                    </a:xfrm>
+                    <a:prstGeom prst="rect"/>
+                  </pic:spPr>
+                </pic:pic>
+              </a:graphicData>
+            </a:graphic>
+          </wp:inline>
+        </w:drawing>
+      </w:r>
+    </w:p>
+    <w:p>
+      <w:pPr>
+        <w:spacing w:after="160"/>
+        <w:jc w:val="center"/>
+      </w:pPr>
+      <w:r>
+        <w:rPr>
+          <w:rFonts w:ascii="Times New Roman" w:hAnsi="Times New Roman"/>
+          <w:i/>
+          <w:color w:val="646464"/>
+          <w:sz w:val="22"/>
+        </w:rPr>
+        <w:t>Hình 3.1. Sơ đồ khối kiến trúc phần cứng tổng thể của Hệ thống Cảnh báo Thiên tai đa năng</w:t>
+      </w:r>
+    </w:p>
+    <w:p>
+      <w:pPr>
         <w:keepNext/>
         <w:spacing w:line="360" w:lineRule="auto" w:before="200" w:after="80"/>
       </w:pPr>
@@ -9627,7 +9792,7 @@
         <w:drawing>
           <wp:inline xmlns:a="http://schemas.openxmlformats.org/drawingml/2006/main" xmlns:pic="http://schemas.openxmlformats.org/drawingml/2006/picture">
             <wp:extent cx="5669280" cy="3188970"/>
-            <wp:docPr id="8" name="Picture 8"/>
+            <wp:docPr id="11" name="Picture 11"/>
             <wp:cNvGraphicFramePr>
               <a:graphicFrameLocks noChangeAspect="1"/>
             </wp:cNvGraphicFramePr>
@@ -9639,7 +9804,7 @@
                     <pic:cNvPicPr/>
                   </pic:nvPicPr>
                   <pic:blipFill>
-                    <a:blip r:embed="rId16"/>
+                    <a:blip r:embed="rId19"/>
                     <a:stretch>
                       <a:fillRect/>
                     </a:stretch>
@@ -9670,7 +9835,77 @@
           <w:color w:val="646464"/>
           <w:sz w:val="22"/>
         </w:rPr>
-        <w:t>Hình 3.1. Sơ đồ nối chân phần cứng chi tiết của Hệ thống Cảnh báo Thiên tai đa năng ESP32</w:t>
+        <w:t>Hình 3.2. Sơ đồ nối chân phần cứng chi tiết của Hệ thống Cảnh báo Thiên tai đa năng ESP32</w:t>
+      </w:r>
+    </w:p>
+    <w:p>
+      <w:pPr>
+        <w:spacing w:line="360" w:lineRule="auto" w:after="80"/>
+        <w:jc w:val="both"/>
+      </w:pPr>
+      <w:r>
+        <w:rPr>
+          <w:rFonts w:ascii="Times New Roman" w:hAnsi="Times New Roman"/>
+          <w:i w:val="0"/>
+          <w:color w:val="222222"/>
+          <w:sz w:val="24"/>
+        </w:rPr>
+        <w:t>Bên cạnh bảng nối chân, mô hình đấu nối dây thực tế trên Breadboard được mô phỏng trực quan giúp quá trình lắp ráp mạch diễn ra chuẩn xác, tránh ngắn mạch:</w:t>
+      </w:r>
+    </w:p>
+    <w:p>
+      <w:pPr>
+        <w:spacing w:before="160" w:after="80"/>
+        <w:jc w:val="center"/>
+      </w:pPr>
+      <w:r>
+        <w:drawing>
+          <wp:inline xmlns:a="http://schemas.openxmlformats.org/drawingml/2006/main" xmlns:pic="http://schemas.openxmlformats.org/drawingml/2006/picture">
+            <wp:extent cx="5303520" cy="3138540"/>
+            <wp:docPr id="12" name="Picture 12"/>
+            <wp:cNvGraphicFramePr>
+              <a:graphicFrameLocks noChangeAspect="1"/>
+            </wp:cNvGraphicFramePr>
+            <a:graphic>
+              <a:graphicData uri="http://schemas.openxmlformats.org/drawingml/2006/picture">
+                <pic:pic>
+                  <pic:nvPicPr>
+                    <pic:cNvPr id="0" name="so_do_dau_noi_breadboard.jpg"/>
+                    <pic:cNvPicPr/>
+                  </pic:nvPicPr>
+                  <pic:blipFill>
+                    <a:blip r:embed="rId20"/>
+                    <a:stretch>
+                      <a:fillRect/>
+                    </a:stretch>
+                  </pic:blipFill>
+                  <pic:spPr>
+                    <a:xfrm>
+                      <a:off x="0" y="0"/>
+                      <a:ext cx="5303520" cy="3138540"/>
+                    </a:xfrm>
+                    <a:prstGeom prst="rect"/>
+                  </pic:spPr>
+                </pic:pic>
+              </a:graphicData>
+            </a:graphic>
+          </wp:inline>
+        </w:drawing>
+      </w:r>
+    </w:p>
+    <w:p>
+      <w:pPr>
+        <w:spacing w:after="160"/>
+        <w:jc w:val="center"/>
+      </w:pPr>
+      <w:r>
+        <w:rPr>
+          <w:rFonts w:ascii="Times New Roman" w:hAnsi="Times New Roman"/>
+          <w:i/>
+          <w:color w:val="646464"/>
+          <w:sz w:val="22"/>
+        </w:rPr>
+        <w:t>Hình 3.3. Sơ đồ nguyên lý đấu nối dây các linh kiện phần cứng trên Breadboard</w:t>
       </w:r>
     </w:p>
     <w:p>
@@ -11927,7 +12162,7 @@
         <w:drawing>
           <wp:inline xmlns:a="http://schemas.openxmlformats.org/drawingml/2006/main" xmlns:pic="http://schemas.openxmlformats.org/drawingml/2006/picture">
             <wp:extent cx="5029200" cy="2828925"/>
-            <wp:docPr id="9" name="Picture 9"/>
+            <wp:docPr id="13" name="Picture 13"/>
             <wp:cNvGraphicFramePr>
               <a:graphicFrameLocks noChangeAspect="1"/>
             </wp:cNvGraphicFramePr>
@@ -11939,7 +12174,7 @@
                     <pic:cNvPicPr/>
                   </pic:nvPicPr>
                   <pic:blipFill>
-                    <a:blip r:embed="rId17"/>
+                    <a:blip r:embed="rId21"/>
                     <a:stretch>
                       <a:fillRect/>
                     </a:stretch>
@@ -11970,7 +12205,7 @@
           <w:color w:val="646464"/>
           <w:sz w:val="22"/>
         </w:rPr>
-        <w:t>Hình 3.2. Biểu đồ so sánh độ trễ kích hoạt còi tại chỗ trước và sau khi ứng dụng FreeRTOS đa nhân</w:t>
+        <w:t>Hình 3.4. Biểu đồ so sánh độ trễ kích hoạt còi tại chỗ trước và sau khi ứng dụng FreeRTOS đa nhân</w:t>
       </w:r>
     </w:p>
     <w:p>
@@ -13847,7 +14082,7 @@
         <w:drawing>
           <wp:inline xmlns:a="http://schemas.openxmlformats.org/drawingml/2006/main" xmlns:pic="http://schemas.openxmlformats.org/drawingml/2006/picture">
             <wp:extent cx="5486400" cy="3086100"/>
-            <wp:docPr id="10" name="Picture 10"/>
+            <wp:docPr id="14" name="Picture 14"/>
             <wp:cNvGraphicFramePr>
               <a:graphicFrameLocks noChangeAspect="1"/>
             </wp:cNvGraphicFramePr>
@@ -13859,7 +14094,7 @@
                     <pic:cNvPicPr/>
                   </pic:nvPicPr>
                   <pic:blipFill>
-                    <a:blip r:embed="rId16"/>
+                    <a:blip r:embed="rId19"/>
                     <a:stretch>
                       <a:fillRect/>
                     </a:stretch>
@@ -13891,6 +14126,61 @@
           <w:sz w:val="22"/>
         </w:rPr>
         <w:t>Hình B.1. Sơ đồ nối dây phần cứng chi tiết của hệ thống (Định dạng chuẩn 16:9)</w:t>
+      </w:r>
+    </w:p>
+    <w:p>
+      <w:pPr>
+        <w:spacing w:before="160" w:after="80"/>
+        <w:jc w:val="center"/>
+      </w:pPr>
+      <w:r>
+        <w:drawing>
+          <wp:inline xmlns:a="http://schemas.openxmlformats.org/drawingml/2006/main" xmlns:pic="http://schemas.openxmlformats.org/drawingml/2006/picture">
+            <wp:extent cx="5303520" cy="3138540"/>
+            <wp:docPr id="15" name="Picture 15"/>
+            <wp:cNvGraphicFramePr>
+              <a:graphicFrameLocks noChangeAspect="1"/>
+            </wp:cNvGraphicFramePr>
+            <a:graphic>
+              <a:graphicData uri="http://schemas.openxmlformats.org/drawingml/2006/picture">
+                <pic:pic>
+                  <pic:nvPicPr>
+                    <pic:cNvPr id="0" name="so_do_dau_noi_breadboard.jpg"/>
+                    <pic:cNvPicPr/>
+                  </pic:nvPicPr>
+                  <pic:blipFill>
+                    <a:blip r:embed="rId20"/>
+                    <a:stretch>
+                      <a:fillRect/>
+                    </a:stretch>
+                  </pic:blipFill>
+                  <pic:spPr>
+                    <a:xfrm>
+                      <a:off x="0" y="0"/>
+                      <a:ext cx="5303520" cy="3138540"/>
+                    </a:xfrm>
+                    <a:prstGeom prst="rect"/>
+                  </pic:spPr>
+                </pic:pic>
+              </a:graphicData>
+            </a:graphic>
+          </wp:inline>
+        </w:drawing>
+      </w:r>
+    </w:p>
+    <w:p>
+      <w:pPr>
+        <w:spacing w:after="160"/>
+        <w:jc w:val="center"/>
+      </w:pPr>
+      <w:r>
+        <w:rPr>
+          <w:rFonts w:ascii="Times New Roman" w:hAnsi="Times New Roman"/>
+          <w:i/>
+          <w:color w:val="646464"/>
+          <w:sz w:val="22"/>
+        </w:rPr>
+        <w:t>Hình B.2. Sơ đồ bố trí và đấu nối dây mô hình phần cứng thực nghiệm trên Breadboard</w:t>
       </w:r>
     </w:p>
     <w:p>

</xml_diff>